<commit_message>
Bài 90m2 bản 2: sửa theo 3 nhận xét của Trang + chốt trục xuyên suốt
Chủ đề xuyên suốt Trang chốt: phân khu, luồng di chuyển, hiện đại.

- Bỏ toàn bộ 71 dấu gạch ngang dài trong bài, viết lại thành câu
  có dấu phẩy hoặc tách câu; sửa cả tiêu đề trong 3 ảnh sơ đồ
- Chèn từ khóa chính vào 23/38 heading, mật độ 1,66%, phân bổ dọc bài
- Đổi tên mục 5 cho dễ hiểu: "Khách đi lối nào, nhân viên đi lối nào
  trong văn phòng 90m2?"
- Cài vế hiện đại thành mạch xuyên suốt: tiêu đề bài, sapo, mục 3.1 mới
  (bảng so chia khu kiểu cũ với chia khu hiện đại, thêm 4-6 chỗ ngồi),
  mục 6 intro, mục 9.3 và kết bài

Bài dài 7.124 chữ, 50 ảnh, 10 bảng.

Co-Authored-By: Claude Opus 5 <noreply@anthropic.com>
Claude-Session: https://claude.ai/code/session_01RQ7hSiqgQAkqf6RgYNY3Pj
</commit_message>
<xml_diff>
--- a/Kết quả công việc Agent Boss/Viec that - Phan tich SEO van phong 90m2/bai-viet/bai-viet-thiet-ke-van-phong-90m2.docx
+++ b/Kết quả công việc Agent Boss/Viec that - Phan tich SEO van phong 90m2/bai-viet/bai-viet-thiet-ke-van-phong-90m2.docx
@@ -14,7 +14,7 @@
           <w:color w:val="1F2A44"/>
           <w:sz w:val="40"/>
         </w:rPr>
-        <w:t>Thiết kế văn phòng 90m2: chia 5 khu, đủ 15–18 chỗ ngồi</w:t>
+        <w:t>Thiết kế văn phòng 90m2 hiện đại: chia 5 khu, đủ 15–18 chỗ ngồi</w:t>
       </w:r>
     </w:p>
     <w:p>
@@ -29,7 +29,7 @@
           <w:color w:val="6B7280"/>
           <w:sz w:val="21"/>
         </w:rPr>
-        <w:t>Tác giả: Đặng Trường Minh — Giám đốc Thiết kế · Cập nhật 13/09/2026</w:t>
+        <w:t>Tác giả: Đặng Trường Minh, Giám đốc Thiết kế · Cập nhật 13/09/2026</w:t>
       </w:r>
     </w:p>
     <w:p>
@@ -83,7 +83,7 @@
           <w:i w:val="0"/>
           <w:sz w:val="25"/>
         </w:rPr>
-        <w:t>Bài viết đưa bảng phân bổ diện tích 5 khu, ba sơ đồ mặt bằng vẽ theo ba hình dạng thực tế kèm luồng đi của khách và của nhân viên, các mẫu thiết kế theo phong cách và chi phí tham khảo theo giá thị trường — để doanh nghiệp chốt được phương án ngay từ bản vẽ đầu tiên.</w:t>
+        <w:t>Bài viết đi theo đúng cách làm của văn phòng hiện đại, tức chia khu bằng kính và nội thất thay vì bằng tường, với bảng phân bổ diện tích 5 khu, ba sơ đồ mặt bằng kèm luồng đi của khách và của nhân viên, các mẫu thiết kế theo phong cách và chi phí tham khảo theo giá thị trường, để doanh nghiệp chốt được phương án ngay từ bản vẽ đầu tiên.</w:t>
       </w:r>
     </w:p>
     <w:p>
@@ -138,7 +138,7 @@
           <w:color w:val="5B6478"/>
           <w:sz w:val="20"/>
         </w:rPr>
-        <w:t>Thiết kế văn phòng 90m2 — đủ diện tích cho cả năm khu chức năng mà vẫn giữ được chỗ ngồi (Ảnh tham khảo)</w:t>
+        <w:t>Thiết kế văn phòng 90m2 hiện đại: đủ diện tích cho cả năm khu chức năng mà vẫn giữ được chỗ ngồi (Ảnh tham khảo)</w:t>
       </w:r>
     </w:p>
     <w:p>
@@ -153,7 +153,7 @@
           <w:color w:val="0B3D91"/>
           <w:sz w:val="32"/>
         </w:rPr>
-        <w:t>1. Văn phòng 90m2 bố trí được bao nhiêu người?</w:t>
+        <w:t>1. Thiết kế văn phòng 90m2 bố trí được bao nhiêu người?</w:t>
       </w:r>
     </w:p>
     <w:p>
@@ -201,7 +201,7 @@
           <w:color w:val="1F2A44"/>
           <w:sz w:val="27"/>
         </w:rPr>
-        <w:t>1.1. Ba mức bố trí văn phòng 90m2 và số chỗ ngồi tương ứng</w:t>
+        <w:t>1.1. Ba mức bố trí trong thiết kế văn phòng 90m2 và số chỗ ngồi</w:t>
       </w:r>
     </w:p>
     <w:p>
@@ -395,7 +395,7 @@
                 <w:i w:val="0"/>
                 <w:sz w:val="21"/>
               </w:rPr>
-              <w:t>Trung bình — phổ biến nhất</w:t>
+              <w:t>Trung bình, phổ biến nhất</w:t>
             </w:r>
           </w:p>
         </w:tc>
@@ -543,7 +543,7 @@
           <w:color w:val="5B6478"/>
           <w:sz w:val="21"/>
         </w:rPr>
-        <w:t>Cơ sở tham khảo: TCVN 4601:2012 — Công sở cơ quan hành chính nhà nước (tiêu chuẩn diện tích làm việc) và các tài liệu tiêu chuẩn diện tích văn phòng thương mại. Đây là khoảng tham khảo, không phải con số bắt buộc.</w:t>
+        <w:t>Cơ sở tham khảo: TCVN 4601:2012 về công sở cơ quan hành chính nhà nước (tiêu chuẩn diện tích làm việc) và các tài liệu tiêu chuẩn diện tích văn phòng thương mại. Đây là khoảng tham khảo, không phải con số bắt buộc.</w:t>
       </w:r>
     </w:p>
     <w:p>
@@ -558,7 +558,7 @@
           <w:color w:val="1F2A44"/>
           <w:sz w:val="27"/>
         </w:rPr>
-        <w:t>1.2. Cách tính: con số 15 – 18 chỗ ra từ đâu?</w:t>
+        <w:t>1.2. Cách tính số chỗ ngồi cho văn phòng 90m2</w:t>
       </w:r>
     </w:p>
     <w:p>
@@ -1003,7 +1003,7 @@
           <w:i w:val="0"/>
           <w:sz w:val="24"/>
         </w:rPr>
-        <w:t xml:space="preserve"> Lối đi 1,2m và lối đi 1,5m chênh nhau 3 – 4m² trên toàn mặt bằng — đủ để mất thêm một đến hai chỗ ngồi.</w:t>
+        <w:t xml:space="preserve"> Lối đi 1,2m và lối đi 1,5m chênh nhau 3 – 4m² trên toàn mặt bằng, đủ để mất thêm một đến hai chỗ ngồi.</w:t>
       </w:r>
     </w:p>
     <w:p>
@@ -1091,7 +1091,7 @@
           <w:color w:val="5B6478"/>
           <w:sz w:val="20"/>
         </w:rPr>
-        <w:t>Bàn 1,2m × 0,6m kê theo cụm và vách kính thay vách đặc — hai lựa chọn quyết định số chỗ ngồi cuối cùng (Ảnh tham khảo)</w:t>
+        <w:t>Bàn 1,2m × 0,6m kê theo cụm và vách kính thay vách đặc, hai lựa chọn quyết định số chỗ ngồi cuối cùng (Ảnh tham khảo)</w:t>
       </w:r>
     </w:p>
     <w:p>
@@ -1106,7 +1106,7 @@
           <w:color w:val="0B3D91"/>
           <w:sz w:val="32"/>
         </w:rPr>
-        <w:t>2. Văn phòng 90m2 khác gì 70m2 và 80m2?</w:t>
+        <w:t>2. Thiết kế văn phòng 90m2 khác gì 70m2 và 80m2?</w:t>
       </w:r>
     </w:p>
     <w:p>
@@ -1691,7 +1691,7 @@
           <w:i w:val="0"/>
           <w:sz w:val="24"/>
         </w:rPr>
-        <w:t xml:space="preserve"> — đó là bài toán đánh đổi. Lên 90m², cũng phòng giám đốc đó gần như không lấy đi chỗ nào, vì phần diện tích tăng thêm đủ bù. Câu hỏi vì thế đổi hẳn: không còn là “phải bỏ gì”, mà là </w:t>
+        <w:t xml:space="preserve">, đó là bài toán đánh đổi. Lên 90m², cũng phòng giám đốc đó gần như không lấy đi chỗ nào, vì phần diện tích tăng thêm đủ bù. Câu hỏi vì thế đổi hẳn: không còn là “phải bỏ gì”, mà là </w:t>
       </w:r>
       <w:r>
         <w:rPr>
@@ -1724,7 +1724,7 @@
           <w:i w:val="0"/>
           <w:sz w:val="24"/>
         </w:rPr>
-        <w:t>Đó cũng là lý do toàn bộ phần còn lại của bài này nói về phân khu và luồng di chuyển, chứ không nói về cách cắt bớt.</w:t>
+        <w:t>Đó cũng là lý do toàn bộ phần còn lại của bài này nói về ba thứ: phân khu, luồng di chuyển và cách làm hiện đại. Không mục nào nói về cách cắt bớt, vì ở 90m² doanh nghiệp không còn phải cắt.</w:t>
       </w:r>
     </w:p>
     <w:p>
@@ -1739,7 +1739,7 @@
           <w:color w:val="0B3D91"/>
           <w:sz w:val="32"/>
         </w:rPr>
-        <w:t>3. Bố trí văn phòng 90m2: chia 5 khu và bảng phân bổ diện tích</w:t>
+        <w:t>3. Bố trí văn phòng 90m2 hiện đại: chia 5 khu và bảng phân bổ diện tích</w:t>
       </w:r>
     </w:p>
     <w:p>
@@ -2308,7 +2308,7 @@
                 <w:i w:val="0"/>
                 <w:sz w:val="21"/>
               </w:rPr>
-              <w:t>Đặt xa khu làm việc và xa lễ tân — mùi và tiếng ồn</w:t>
+              <w:t>Đặt xa khu làm việc và xa lễ tân vì mùi và tiếng ồn</w:t>
             </w:r>
           </w:p>
         </w:tc>
@@ -2441,7 +2441,7 @@
           <w:i w:val="0"/>
           <w:sz w:val="24"/>
         </w:rPr>
-        <w:t xml:space="preserve"> — thấp hơn là mặt bằng đang bị chia quá vụn. Và </w:t>
+        <w:t xml:space="preserve">. Thấp hơn là mặt bằng đang bị chia quá vụn. Và </w:t>
       </w:r>
       <w:r>
         <w:rPr>
@@ -2459,7 +2459,525 @@
           <w:i w:val="0"/>
           <w:sz w:val="24"/>
         </w:rPr>
-        <w:t xml:space="preserve"> — vượt là đang lãng phí, thường do mặt bằng quá dài hoặc do đặt phòng kín sai chỗ khiến phải chạy vòng.</w:t>
+        <w:t>. Vượt là đang lãng phí, thường do mặt bằng quá dài hoặc do đặt phòng kín sai chỗ khiến phải chạy vòng.</w:t>
+      </w:r>
+    </w:p>
+    <w:p>
+      <w:pPr>
+        <w:spacing w:before="280" w:after="120"/>
+      </w:pPr>
+      <w:r>
+        <w:rPr>
+          <w:rFonts w:ascii="Times New Roman" w:hAnsi="Times New Roman"/>
+          <w:b/>
+          <w:i w:val="0"/>
+          <w:color w:val="1F2A44"/>
+          <w:sz w:val="27"/>
+        </w:rPr>
+        <w:t>3.1. Chia khu kiểu cũ và chia khu trong thiết kế văn phòng 90m2 hiện đại</w:t>
+      </w:r>
+    </w:p>
+    <w:p>
+      <w:pPr>
+        <w:spacing w:after="160"/>
+        <w:jc w:val="both"/>
+      </w:pPr>
+      <w:r>
+        <w:rPr>
+          <w:rFonts w:ascii="Times New Roman" w:hAnsi="Times New Roman"/>
+          <w:b w:val="0"/>
+          <w:i w:val="0"/>
+          <w:sz w:val="24"/>
+        </w:rPr>
+        <w:t>Cùng năm khu như nhau, nhưng cách chia của mười năm trước và cách chia hiện nay cho ra hai kết quả rất khác về số chỗ ngồi. Bảng dưới đây là năm điểm đổi thay rõ nhất:</w:t>
+      </w:r>
+    </w:p>
+    <w:tbl>
+      <w:tblPr>
+        <w:tblStyle w:val="TableGrid"/>
+        <w:tblW w:type="auto" w:w="0"/>
+        <w:jc w:val="center"/>
+        <w:tblLook w:firstColumn="1" w:firstRow="1" w:lastColumn="0" w:lastRow="0" w:noHBand="0" w:noVBand="1" w:val="04A0"/>
+      </w:tblPr>
+      <w:tblGrid>
+        <w:gridCol w:w="2436"/>
+        <w:gridCol w:w="2436"/>
+        <w:gridCol w:w="2436"/>
+        <w:gridCol w:w="2436"/>
+      </w:tblGrid>
+      <w:tr>
+        <w:tc>
+          <w:tcPr>
+            <w:tcW w:type="dxa" w:w="2436"/>
+            <w:shd w:val="clear" w:fill="0B3D91"/>
+          </w:tcPr>
+          <w:p>
+            <w:r/>
+            <w:r>
+              <w:rPr>
+                <w:rFonts w:ascii="Times New Roman" w:hAnsi="Times New Roman"/>
+                <w:b/>
+                <w:i w:val="0"/>
+                <w:color w:val="FFFFFF"/>
+                <w:sz w:val="21"/>
+              </w:rPr>
+              <w:t>Hạng mục</w:t>
+            </w:r>
+          </w:p>
+        </w:tc>
+        <w:tc>
+          <w:tcPr>
+            <w:tcW w:type="dxa" w:w="2436"/>
+            <w:shd w:val="clear" w:fill="0B3D91"/>
+          </w:tcPr>
+          <w:p>
+            <w:r/>
+            <w:r>
+              <w:rPr>
+                <w:rFonts w:ascii="Times New Roman" w:hAnsi="Times New Roman"/>
+                <w:b/>
+                <w:i w:val="0"/>
+                <w:color w:val="FFFFFF"/>
+                <w:sz w:val="21"/>
+              </w:rPr>
+              <w:t>Cách chia kiểu cũ</w:t>
+            </w:r>
+          </w:p>
+        </w:tc>
+        <w:tc>
+          <w:tcPr>
+            <w:tcW w:type="dxa" w:w="2436"/>
+            <w:shd w:val="clear" w:fill="0B3D91"/>
+          </w:tcPr>
+          <w:p>
+            <w:r/>
+            <w:r>
+              <w:rPr>
+                <w:rFonts w:ascii="Times New Roman" w:hAnsi="Times New Roman"/>
+                <w:b/>
+                <w:i w:val="0"/>
+                <w:color w:val="FFFFFF"/>
+                <w:sz w:val="21"/>
+              </w:rPr>
+              <w:t>Cách chia hiện đại</w:t>
+            </w:r>
+          </w:p>
+        </w:tc>
+        <w:tc>
+          <w:tcPr>
+            <w:tcW w:type="dxa" w:w="2436"/>
+            <w:shd w:val="clear" w:fill="0B3D91"/>
+          </w:tcPr>
+          <w:p>
+            <w:r/>
+            <w:r>
+              <w:rPr>
+                <w:rFonts w:ascii="Times New Roman" w:hAnsi="Times New Roman"/>
+                <w:b/>
+                <w:i w:val="0"/>
+                <w:color w:val="FFFFFF"/>
+                <w:sz w:val="21"/>
+              </w:rPr>
+              <w:t>Được gì</w:t>
+            </w:r>
+          </w:p>
+        </w:tc>
+      </w:tr>
+      <w:tr>
+        <w:tc>
+          <w:tcPr>
+            <w:tcW w:type="dxa" w:w="2436"/>
+          </w:tcPr>
+          <w:p>
+            <w:r/>
+            <w:r>
+              <w:rPr>
+                <w:rFonts w:ascii="Times New Roman" w:hAnsi="Times New Roman"/>
+                <w:b w:val="0"/>
+                <w:i w:val="0"/>
+                <w:sz w:val="21"/>
+              </w:rPr>
+              <w:t>Ranh giới giữa các khu</w:t>
+            </w:r>
+          </w:p>
+        </w:tc>
+        <w:tc>
+          <w:tcPr>
+            <w:tcW w:type="dxa" w:w="2436"/>
+          </w:tcPr>
+          <w:p>
+            <w:r/>
+            <w:r>
+              <w:rPr>
+                <w:rFonts w:ascii="Times New Roman" w:hAnsi="Times New Roman"/>
+                <w:b w:val="0"/>
+                <w:i w:val="0"/>
+                <w:sz w:val="21"/>
+              </w:rPr>
+              <w:t>Vách thạch cao đặc, cao kịch trần</w:t>
+            </w:r>
+          </w:p>
+        </w:tc>
+        <w:tc>
+          <w:tcPr>
+            <w:tcW w:type="dxa" w:w="2436"/>
+          </w:tcPr>
+          <w:p>
+            <w:r/>
+            <w:r>
+              <w:rPr>
+                <w:rFonts w:ascii="Times New Roman" w:hAnsi="Times New Roman"/>
+                <w:b w:val="0"/>
+                <w:i w:val="0"/>
+                <w:sz w:val="21"/>
+              </w:rPr>
+              <w:t>Vách kính khung nhôm hoặc khung thép</w:t>
+            </w:r>
+          </w:p>
+        </w:tc>
+        <w:tc>
+          <w:tcPr>
+            <w:tcW w:type="dxa" w:w="2436"/>
+          </w:tcPr>
+          <w:p>
+            <w:r/>
+            <w:r>
+              <w:rPr>
+                <w:rFonts w:ascii="Times New Roman" w:hAnsi="Times New Roman"/>
+                <w:b w:val="0"/>
+                <w:i w:val="0"/>
+                <w:sz w:val="21"/>
+              </w:rPr>
+              <w:t>Trả lại 4 – 5m² sàn, tức 2 chỗ ngồi</w:t>
+            </w:r>
+          </w:p>
+        </w:tc>
+      </w:tr>
+      <w:tr>
+        <w:tc>
+          <w:tcPr>
+            <w:tcW w:type="dxa" w:w="2436"/>
+            <w:shd w:val="clear" w:fill="F2F5FA"/>
+          </w:tcPr>
+          <w:p>
+            <w:r/>
+            <w:r>
+              <w:rPr>
+                <w:rFonts w:ascii="Times New Roman" w:hAnsi="Times New Roman"/>
+                <w:b w:val="0"/>
+                <w:i w:val="0"/>
+                <w:sz w:val="21"/>
+              </w:rPr>
+              <w:t>Phòng ban</w:t>
+            </w:r>
+          </w:p>
+        </w:tc>
+        <w:tc>
+          <w:tcPr>
+            <w:tcW w:type="dxa" w:w="2436"/>
+            <w:shd w:val="clear" w:fill="F2F5FA"/>
+          </w:tcPr>
+          <w:p>
+            <w:r/>
+            <w:r>
+              <w:rPr>
+                <w:rFonts w:ascii="Times New Roman" w:hAnsi="Times New Roman"/>
+                <w:b w:val="0"/>
+                <w:i w:val="0"/>
+                <w:sz w:val="21"/>
+              </w:rPr>
+              <w:t>Mỗi bộ phận một phòng riêng</w:t>
+            </w:r>
+          </w:p>
+        </w:tc>
+        <w:tc>
+          <w:tcPr>
+            <w:tcW w:type="dxa" w:w="2436"/>
+            <w:shd w:val="clear" w:fill="F2F5FA"/>
+          </w:tcPr>
+          <w:p>
+            <w:r/>
+            <w:r>
+              <w:rPr>
+                <w:rFonts w:ascii="Times New Roman" w:hAnsi="Times New Roman"/>
+                <w:b w:val="0"/>
+                <w:i w:val="0"/>
+                <w:sz w:val="21"/>
+              </w:rPr>
+              <w:t>Một sàn mở, chỉ giữ phòng họp và phòng giám đốc</w:t>
+            </w:r>
+          </w:p>
+        </w:tc>
+        <w:tc>
+          <w:tcPr>
+            <w:tcW w:type="dxa" w:w="2436"/>
+            <w:shd w:val="clear" w:fill="F2F5FA"/>
+          </w:tcPr>
+          <w:p>
+            <w:r/>
+            <w:r>
+              <w:rPr>
+                <w:rFonts w:ascii="Times New Roman" w:hAnsi="Times New Roman"/>
+                <w:b w:val="0"/>
+                <w:i w:val="0"/>
+                <w:sz w:val="21"/>
+              </w:rPr>
+              <w:t>Bớt 9 – 12m² tường và hành lang dẫn vào</w:t>
+            </w:r>
+          </w:p>
+        </w:tc>
+      </w:tr>
+      <w:tr>
+        <w:tc>
+          <w:tcPr>
+            <w:tcW w:type="dxa" w:w="2436"/>
+          </w:tcPr>
+          <w:p>
+            <w:r/>
+            <w:r>
+              <w:rPr>
+                <w:rFonts w:ascii="Times New Roman" w:hAnsi="Times New Roman"/>
+                <w:b w:val="0"/>
+                <w:i w:val="0"/>
+                <w:sz w:val="21"/>
+              </w:rPr>
+              <w:t>Lối đi</w:t>
+            </w:r>
+          </w:p>
+        </w:tc>
+        <w:tc>
+          <w:tcPr>
+            <w:tcW w:type="dxa" w:w="2436"/>
+          </w:tcPr>
+          <w:p>
+            <w:r/>
+            <w:r>
+              <w:rPr>
+                <w:rFonts w:ascii="Times New Roman" w:hAnsi="Times New Roman"/>
+                <w:b w:val="0"/>
+                <w:i w:val="0"/>
+                <w:sz w:val="21"/>
+              </w:rPr>
+              <w:t>Hành lang xương cá, nhiều nhánh cụt</w:t>
+            </w:r>
+          </w:p>
+        </w:tc>
+        <w:tc>
+          <w:tcPr>
+            <w:tcW w:type="dxa" w:w="2436"/>
+          </w:tcPr>
+          <w:p>
+            <w:r/>
+            <w:r>
+              <w:rPr>
+                <w:rFonts w:ascii="Times New Roman" w:hAnsi="Times New Roman"/>
+                <w:b w:val="0"/>
+                <w:i w:val="0"/>
+                <w:sz w:val="21"/>
+              </w:rPr>
+              <w:t>Một trục thẳng phục vụ cả mặt bằng</w:t>
+            </w:r>
+          </w:p>
+        </w:tc>
+        <w:tc>
+          <w:tcPr>
+            <w:tcW w:type="dxa" w:w="2436"/>
+          </w:tcPr>
+          <w:p>
+            <w:r/>
+            <w:r>
+              <w:rPr>
+                <w:rFonts w:ascii="Times New Roman" w:hAnsi="Times New Roman"/>
+                <w:b w:val="0"/>
+                <w:i w:val="0"/>
+                <w:sz w:val="21"/>
+              </w:rPr>
+              <w:t>Lối đi giảm từ 18 – 20% xuống 12 – 15%</w:t>
+            </w:r>
+          </w:p>
+        </w:tc>
+      </w:tr>
+      <w:tr>
+        <w:tc>
+          <w:tcPr>
+            <w:tcW w:type="dxa" w:w="2436"/>
+            <w:shd w:val="clear" w:fill="F2F5FA"/>
+          </w:tcPr>
+          <w:p>
+            <w:r/>
+            <w:r>
+              <w:rPr>
+                <w:rFonts w:ascii="Times New Roman" w:hAnsi="Times New Roman"/>
+                <w:b w:val="0"/>
+                <w:i w:val="0"/>
+                <w:sz w:val="21"/>
+              </w:rPr>
+              <w:t>Lưu trữ</w:t>
+            </w:r>
+          </w:p>
+        </w:tc>
+        <w:tc>
+          <w:tcPr>
+            <w:tcW w:type="dxa" w:w="2436"/>
+            <w:shd w:val="clear" w:fill="F2F5FA"/>
+          </w:tcPr>
+          <w:p>
+            <w:r/>
+            <w:r>
+              <w:rPr>
+                <w:rFonts w:ascii="Times New Roman" w:hAnsi="Times New Roman"/>
+                <w:b w:val="0"/>
+                <w:i w:val="0"/>
+                <w:sz w:val="21"/>
+              </w:rPr>
+              <w:t>Tủ hồ sơ đứng cao 2m kê giữa sàn</w:t>
+            </w:r>
+          </w:p>
+        </w:tc>
+        <w:tc>
+          <w:tcPr>
+            <w:tcW w:type="dxa" w:w="2436"/>
+            <w:shd w:val="clear" w:fill="F2F5FA"/>
+          </w:tcPr>
+          <w:p>
+            <w:r/>
+            <w:r>
+              <w:rPr>
+                <w:rFonts w:ascii="Times New Roman" w:hAnsi="Times New Roman"/>
+                <w:b w:val="0"/>
+                <w:i w:val="0"/>
+                <w:sz w:val="21"/>
+              </w:rPr>
+              <w:t>Tủ âm tường cộng lưu trữ số</w:t>
+            </w:r>
+          </w:p>
+        </w:tc>
+        <w:tc>
+          <w:tcPr>
+            <w:tcW w:type="dxa" w:w="2436"/>
+            <w:shd w:val="clear" w:fill="F2F5FA"/>
+          </w:tcPr>
+          <w:p>
+            <w:r/>
+            <w:r>
+              <w:rPr>
+                <w:rFonts w:ascii="Times New Roman" w:hAnsi="Times New Roman"/>
+                <w:b w:val="0"/>
+                <w:i w:val="0"/>
+                <w:sz w:val="21"/>
+              </w:rPr>
+              <w:t>Trả lại 3 – 4m² sàn</w:t>
+            </w:r>
+          </w:p>
+        </w:tc>
+      </w:tr>
+      <w:tr>
+        <w:tc>
+          <w:tcPr>
+            <w:tcW w:type="dxa" w:w="2436"/>
+          </w:tcPr>
+          <w:p>
+            <w:r/>
+            <w:r>
+              <w:rPr>
+                <w:rFonts w:ascii="Times New Roman" w:hAnsi="Times New Roman"/>
+                <w:b w:val="0"/>
+                <w:i w:val="0"/>
+                <w:sz w:val="21"/>
+              </w:rPr>
+              <w:t>Chỗ ngồi</w:t>
+            </w:r>
+          </w:p>
+        </w:tc>
+        <w:tc>
+          <w:tcPr>
+            <w:tcW w:type="dxa" w:w="2436"/>
+          </w:tcPr>
+          <w:p>
+            <w:r/>
+            <w:r>
+              <w:rPr>
+                <w:rFonts w:ascii="Times New Roman" w:hAnsi="Times New Roman"/>
+                <w:b w:val="0"/>
+                <w:i w:val="0"/>
+                <w:sz w:val="21"/>
+              </w:rPr>
+              <w:t>Bàn cố định, kích thước lớn</w:t>
+            </w:r>
+          </w:p>
+        </w:tc>
+        <w:tc>
+          <w:tcPr>
+            <w:tcW w:type="dxa" w:w="2436"/>
+          </w:tcPr>
+          <w:p>
+            <w:r/>
+            <w:r>
+              <w:rPr>
+                <w:rFonts w:ascii="Times New Roman" w:hAnsi="Times New Roman"/>
+                <w:b w:val="0"/>
+                <w:i w:val="0"/>
+                <w:sz w:val="21"/>
+              </w:rPr>
+              <w:t>Bàn mô-đun 1,2 × 0,6m ghép nối được</w:t>
+            </w:r>
+          </w:p>
+        </w:tc>
+        <w:tc>
+          <w:tcPr>
+            <w:tcW w:type="dxa" w:w="2436"/>
+          </w:tcPr>
+          <w:p>
+            <w:r/>
+            <w:r>
+              <w:rPr>
+                <w:rFonts w:ascii="Times New Roman" w:hAnsi="Times New Roman"/>
+                <w:b w:val="0"/>
+                <w:i w:val="0"/>
+                <w:sz w:val="21"/>
+              </w:rPr>
+              <w:t>Thêm 4 – 5 chỗ và đổi bố cục không cần đập vách</w:t>
+            </w:r>
+          </w:p>
+        </w:tc>
+      </w:tr>
+    </w:tbl>
+    <w:p>
+      <w:pPr>
+        <w:spacing w:after="120"/>
+      </w:pPr>
+    </w:p>
+    <w:p>
+      <w:pPr>
+        <w:spacing w:after="160"/>
+        <w:jc w:val="both"/>
+      </w:pPr>
+      <w:r>
+        <w:rPr>
+          <w:rFonts w:ascii="Times New Roman" w:hAnsi="Times New Roman"/>
+          <w:b w:val="0"/>
+          <w:i w:val="0"/>
+          <w:sz w:val="24"/>
+        </w:rPr>
+        <w:t xml:space="preserve">Cộng cả năm dòng lại, cách chia hiện đại cho thêm khoảng </w:t>
+      </w:r>
+      <w:r>
+        <w:rPr>
+          <w:rFonts w:ascii="Times New Roman" w:hAnsi="Times New Roman"/>
+          <w:b/>
+          <w:i w:val="0"/>
+          <w:sz w:val="24"/>
+        </w:rPr>
+        <w:t>4 – 6 chỗ ngồi</w:t>
+      </w:r>
+      <w:r>
+        <w:rPr>
+          <w:rFonts w:ascii="Times New Roman" w:hAnsi="Times New Roman"/>
+          <w:b w:val="0"/>
+          <w:i w:val="0"/>
+          <w:sz w:val="24"/>
+        </w:rPr>
+        <w:t xml:space="preserve"> trên cùng một mặt bằng 90m², mà không phải bỏ khu chức năng nào. Đó là lý do bài này lấy cách làm hiện đại làm mặc định cho mọi phương án phía dưới.</w:t>
       </w:r>
     </w:p>
     <w:p>
@@ -2514,7 +3032,7 @@
           <w:color w:val="5B6478"/>
           <w:sz w:val="20"/>
         </w:rPr>
-        <w:t>Nội thất thay vách ngăn để chia khu mà không dựng thêm tường — cách giữ tỷ lệ khu làm việc chung trên 45% (Ảnh tham khảo)</w:t>
+        <w:t>Nội thất thay vách ngăn để chia khu mà không dựng thêm tường, cách chia khu hiện đại giúp giữ tỷ lệ khu làm việc chung trên 45% (Ảnh tham khảo)</w:t>
       </w:r>
     </w:p>
     <w:p>
@@ -2529,7 +3047,7 @@
           <w:color w:val="0B3D91"/>
           <w:sz w:val="32"/>
         </w:rPr>
-        <w:t>4. Ba sơ đồ mặt bằng văn phòng 90m2 và hai luồng di chuyển</w:t>
+        <w:t>4. Ba sơ đồ mặt bằng trong thiết kế văn phòng 90m2 và hai luồng di chuyển</w:t>
       </w:r>
     </w:p>
     <w:p>
@@ -2544,7 +3062,7 @@
           <w:i w:val="0"/>
           <w:sz w:val="24"/>
         </w:rPr>
-        <w:t xml:space="preserve">Ba sơ đồ dưới đây do đội thiết kế vẽ riêng cho bài viết này, theo ba hình dạng mặt bằng 90m² hay gặp nhất khi thuê văn phòng tại Hà Nội và TP.HCM. Cả ba đều cùng diện tích, cùng giữ đủ năm khu — chỉ khác hình dạng. Trên mỗi sơ đồ có vẽ thêm hai đường: </w:t>
+        <w:t xml:space="preserve">Ba sơ đồ dưới đây do đội thiết kế vẽ riêng cho bài viết này, theo ba hình dạng mặt bằng 90m² hay gặp nhất khi thuê văn phòng tại Hà Nội và TP.HCM. Cả ba đều cùng diện tích, cùng giữ đủ năm khu, chỉ khác hình dạng. Trên mỗi sơ đồ có vẽ thêm hai đường: </w:t>
       </w:r>
       <w:r>
         <w:rPr>
@@ -3017,7 +3535,7 @@
           <w:color w:val="0B3D91"/>
           <w:sz w:val="25"/>
         </w:rPr>
-        <w:t>Sơ đồ 1 — mặt bằng hẹp và dài (18m × 5m) · 15 chỗ ngồi</w:t>
+        <w:t>Sơ đồ 1: mặt bằng hẹp và dài (18m × 5m) · 15 chỗ ngồi</w:t>
       </w:r>
     </w:p>
     <w:p>
@@ -3111,7 +3629,7 @@
           <w:i w:val="0"/>
           <w:sz w:val="24"/>
         </w:rPr>
-        <w:t xml:space="preserve"> phòng họp nằm ở cuối mặt bằng nên khách buộc phải đi dọc hết khu làm việc mới tới nơi. Mỗi lần có khách là cả hai dãy bàn ngẩng lên. Cách chữa duy nhất ở dạng này là đổi chỗ phòng họp lên sát lễ tân và đẩy phòng giám đốc xuống cuối — đổi lại giám đốc mất vị trí gần cửa.</w:t>
+        <w:t xml:space="preserve"> phòng họp nằm ở cuối mặt bằng nên khách buộc phải đi dọc hết khu làm việc mới tới nơi. Mỗi lần có khách là cả hai dãy bàn ngẩng lên. Cách chữa duy nhất ở dạng này là đổi chỗ phòng họp lên sát lễ tân và đẩy phòng giám đốc xuống cuối, đổi lại giám đốc mất vị trí gần cửa.</w:t>
       </w:r>
     </w:p>
     <w:p>
@@ -3126,7 +3644,7 @@
           <w:color w:val="0B3D91"/>
           <w:sz w:val="25"/>
         </w:rPr>
-        <w:t>Sơ đồ 2 — mặt bằng vuông cân xứng (9,5m × 9,5m) · 17 chỗ ngồi</w:t>
+        <w:t>Sơ đồ 2: mặt bằng vuông cân xứng (9,5m × 9,5m) · 17 chỗ ngồi</w:t>
       </w:r>
     </w:p>
     <w:p>
@@ -3220,7 +3738,7 @@
           <w:i w:val="0"/>
           <w:sz w:val="24"/>
         </w:rPr>
-        <w:t xml:space="preserve"> đây là sơ đồ gọn nhất — khách dừng ở lễ tân ngay bên trái cửa, nhân viên rẽ phải theo trục dọc. Hai luồng tách nhau ngay từ ngưỡng cửa. Đổi lại, pantry nằm giữa phòng giám đốc và phòng họp nên phải làm cửa kín và hút mùi tốt.</w:t>
+        <w:t xml:space="preserve"> đây là sơ đồ gọn nhất. Khách dừng ở lễ tân ngay bên trái cửa, nhân viên rẽ phải theo trục dọc. Hai luồng tách nhau ngay từ ngưỡng cửa. Đổi lại, pantry nằm giữa phòng giám đốc và phòng họp nên phải làm cửa kín và hút mùi tốt.</w:t>
       </w:r>
     </w:p>
     <w:p>
@@ -3235,7 +3753,7 @@
           <w:color w:val="0B3D91"/>
           <w:sz w:val="25"/>
         </w:rPr>
-        <w:t>Sơ đồ 3 — mặt bằng lô góc (12m × 7,5m) · 16 chỗ ngồi</w:t>
+        <w:t>Sơ đồ 3: mặt bằng lô góc (12m × 7,5m) · 16 chỗ ngồi</w:t>
       </w:r>
     </w:p>
     <w:p>
@@ -3323,7 +3841,7 @@
           <w:i w:val="0"/>
           <w:sz w:val="24"/>
         </w:rPr>
-        <w:t xml:space="preserve"> chiếm dải trên — thứ chỉ từ 90m² mới làm nổi. Khu làm việc chung 40m² với ba dãy bàn 5 chỗ nằm trọn phía dưới, phòng họp 8,1m² và pantry 3,6m² dồn về cạnh phải.</w:t>
+        <w:t xml:space="preserve"> chiếm dải trên, thứ chỉ từ 90m² mới làm nổi. Khu làm việc chung 40m² với ba dãy bàn 5 chỗ nằm trọn phía dưới, phòng họp 8,1m² và pantry 3,6m² dồn về cạnh phải.</w:t>
       </w:r>
     </w:p>
     <w:p>
@@ -3347,7 +3865,7 @@
           <w:i w:val="0"/>
           <w:sz w:val="24"/>
         </w:rPr>
-        <w:t xml:space="preserve"> đây là sơ đồ sạch nhất về đường đi. Khách vào là ở luôn trong dải tiếp khách phía trên, muốn họp thì rẽ xuống lối đi 1,4m — </w:t>
+        <w:t xml:space="preserve"> đây là sơ đồ sạch nhất về đường đi. Khách vào là ở luôn trong dải tiếp khách phía trên, muốn họp thì rẽ xuống lối đi 1,4m mà </w:t>
       </w:r>
       <w:r>
         <w:rPr>
@@ -3389,7 +3907,7 @@
           <w:i w:val="0"/>
           <w:sz w:val="24"/>
         </w:rPr>
-        <w:t xml:space="preserve"> nếu doanh nghiệp đang đi xem mặt bằng, hãy đứng ở cửa và hỏi đúng một câu — “từ đây tới phòng họp, khách phải đi qua mấy chỗ ngồi?” Câu trả lời là 0 thì mặt bằng đó tốt. Từ 5 chỗ trở lên là sẽ phiền mỗi ngày.</w:t>
+        <w:t xml:space="preserve"> nếu doanh nghiệp đang đi xem mặt bằng, hãy đứng ở cửa và hỏi đúng một câu: “từ đây tới phòng họp, khách phải đi qua mấy chỗ ngồi?” Câu trả lời là 0 thì mặt bằng đó tốt. Từ 5 chỗ trở lên là sẽ phiền mỗi ngày.</w:t>
       </w:r>
     </w:p>
     <w:p>
@@ -3404,7 +3922,7 @@
           <w:color w:val="0B3D91"/>
           <w:sz w:val="32"/>
         </w:rPr>
-        <w:t>5. Luồng khách và luồng nhân viên — thứ quyết định văn phòng 90m2 có chạy trơn không</w:t>
+        <w:t>5. Khách đi lối nào, nhân viên đi lối nào trong văn phòng 90m2?</w:t>
       </w:r>
     </w:p>
     <w:p>
@@ -3419,7 +3937,7 @@
           <w:i w:val="0"/>
           <w:sz w:val="24"/>
         </w:rPr>
-        <w:t>Ở 70m² thì không có gì để bàn: mặt bằng nhỏ, ai cũng đi chung một lối. Từ 90m² trở lên, hai luồng này tách được — và nếu không tách, doanh nghiệp sẽ trả giá mỗi ngày bằng những phiền toái nhỏ mà không ai gọi tên ra được.</w:t>
+        <w:t>Ở 70m² thì không có gì để bàn: mặt bằng nhỏ, ai cũng đi chung một lối. Từ 90m² trở lên, hai luồng này tách được, và nếu không tách, doanh nghiệp sẽ trả giá mỗi ngày bằng những phiền toái nhỏ mà không ai gọi tên ra được.</w:t>
       </w:r>
     </w:p>
     <w:p>
@@ -3767,7 +4285,7 @@
           <w:color w:val="1F2A44"/>
           <w:sz w:val="27"/>
         </w:rPr>
-        <w:t>5.2. Ba lỗi luồng hay gặp nhất ở văn phòng 90m2</w:t>
+        <w:t>5.2. Ba lỗi hay gặp khi thiết kế văn phòng 90m2 về đường đi lại</w:t>
       </w:r>
     </w:p>
     <w:tbl>
@@ -4021,7 +4539,7 @@
           <w:color w:val="1F2A44"/>
           <w:sz w:val="27"/>
         </w:rPr>
-        <w:t>5.3. Tách tiếng ồn trong văn phòng 90m2 mà không xây thêm tường</w:t>
+        <w:t>5.3. Cách tách tiếng ồn trong văn phòng 90m2 mà không xây thêm tường</w:t>
       </w:r>
     </w:p>
     <w:p>
@@ -4051,7 +4569,7 @@
           <w:i w:val="0"/>
           <w:sz w:val="24"/>
         </w:rPr>
-        <w:t>Tủ thấp 1,1 – 1,2m làm vách mềm</w:t>
+        <w:t>Tủ thấp 1,1 – 1,2m làm vách mềm.</w:t>
       </w:r>
       <w:r>
         <w:rPr>
@@ -4060,7 +4578,7 @@
           <w:i w:val="0"/>
           <w:sz w:val="24"/>
         </w:rPr>
-        <w:t xml:space="preserve"> — chặn được đường truyền âm ngang tầm ngồi, không chắn sáng, không tính là hạng mục xây dựng. Rẻ nhất.</w:t>
+        <w:t xml:space="preserve"> Chặn được đường truyền âm ngang tầm ngồi, không chắn sáng, không tính là hạng mục xây dựng. Rẻ nhất.</w:t>
       </w:r>
     </w:p>
     <w:p>
@@ -4075,7 +4593,7 @@
           <w:i w:val="0"/>
           <w:sz w:val="24"/>
         </w:rPr>
-        <w:t>Tấm tiêu âm treo trần phía trên khu làm việc</w:t>
+        <w:t>Tấm tiêu âm treo trần phía trên khu làm việc.</w:t>
       </w:r>
       <w:r>
         <w:rPr>
@@ -4084,7 +4602,7 @@
           <w:i w:val="0"/>
           <w:sz w:val="24"/>
         </w:rPr>
-        <w:t xml:space="preserve"> — khoảng 300.000 – 600.000đ/m² trần, xử lý được phần tiếng vọng, không đụng tới mặt bằng.</w:t>
+        <w:t xml:space="preserve"> Chi phí khoảng 300.000 – 600.000đ/m² trần, xử lý được phần tiếng vọng, không đụng tới mặt bằng.</w:t>
       </w:r>
     </w:p>
     <w:p>
@@ -4099,7 +4617,7 @@
           <w:i w:val="0"/>
           <w:sz w:val="24"/>
         </w:rPr>
-        <w:t>Vách kính hai lớp cho phòng họp</w:t>
+        <w:t>Vách kính hai lớp cho phòng họp.</w:t>
       </w:r>
       <w:r>
         <w:rPr>
@@ -4108,7 +4626,7 @@
           <w:i w:val="0"/>
           <w:sz w:val="24"/>
         </w:rPr>
-        <w:t xml:space="preserve"> — đắt nhất trong ba cách nhưng là cách duy nhất cách âm thật sự cho cuộc họp có khách.</w:t>
+        <w:t xml:space="preserve"> Đắt nhất trong ba cách nhưng là cách duy nhất cách âm thật sự cho cuộc họp có khách.</w:t>
       </w:r>
     </w:p>
     <w:p>
@@ -4178,7 +4696,7 @@
           <w:color w:val="5B6478"/>
           <w:sz w:val="20"/>
         </w:rPr>
-        <w:t>Vách kính khung thép chia phòng họp mà vẫn giữ tầm nhìn — cách tách tiếng ồn không làm mặt bằng bị cắt vụn (Ảnh tham khảo)</w:t>
+        <w:t>Vách kính khung thép chia phòng họp mà vẫn giữ tầm nhìn, cách tách tiếng ồn không làm mặt bằng bị cắt vụn (Ảnh tham khảo)</w:t>
       </w:r>
     </w:p>
     <w:p>
@@ -4248,7 +4766,7 @@
           <w:color w:val="0B3D91"/>
           <w:sz w:val="32"/>
         </w:rPr>
-        <w:t>6. Mẫu thiết kế văn phòng 90m2 theo phong cách</w:t>
+        <w:t>6. Mẫu thiết kế văn phòng 90m2 hiện đại theo từng phong cách</w:t>
       </w:r>
     </w:p>
     <w:p>
@@ -4263,7 +4781,7 @@
           <w:i w:val="0"/>
           <w:sz w:val="24"/>
         </w:rPr>
-        <w:t>Phong cách không chỉ là chuyện đẹp xấu. Ở 90m², phong cách quyết định luôn việc phân khu dễ hay khó: phong cách dùng nhiều vách đặc thì chia khu bằng tường, phong cách dùng kính và nội thất nhẹ thì chia khu bằng đồ đạc và giữ được cả sàn liền mạch. Năm phong cách dưới đây được doanh nghiệp chọn nhiều nhất cho diện tích này — kèm con số cụ thể cho thấy mỗi phong cách ảnh hưởng thế nào tới chỗ ngồi và tới chi phí.</w:t>
+        <w:t>Phong cách không chỉ là chuyện đẹp xấu. Ở 90m², phong cách quyết định luôn việc phân khu dễ hay khó: phong cách dùng nhiều vách đặc thì chia khu bằng tường, phong cách dùng kính và nội thất nhẹ thì chia khu bằng đồ đạc và giữ được cả sàn liền mạch. Năm phong cách dưới đây được doanh nghiệp chọn nhiều nhất cho diện tích này, kèm con số cụ thể cho thấy mỗi phong cách ảnh hưởng thế nào tới chỗ ngồi và tới chi phí. Cả năm đều được trình bày theo cách làm hiện đại đã nói ở mục 3, tức chia khu bằng kính và nội thất thay vì bằng tường. Phong cách hiện đại đặt đầu tiên vì đó là mặc định an toàn nhất; bốn phong cách còn lại là bốn cách khoác lớp áo khác lên cùng một bộ khung ấy.</w:t>
       </w:r>
     </w:p>
     <w:p>
@@ -4419,7 +4937,7 @@
           <w:i w:val="0"/>
           <w:sz w:val="24"/>
         </w:rPr>
-        <w:t xml:space="preserve">So sánh trực tiếp trên cùng mặt bằng 90m²: phòng họp 8 chỗ làm bằng vách thạch cao hai lớp chiếm khoảng 14m² tính cả tường; cũng phòng họp đó làm bằng vách kính khung nhôm chỉ chiếm khoảng 12m². Cộng thêm phòng giám đốc, hai vách kính trả lại khoảng 4m² — đúng bằng </w:t>
+        <w:t xml:space="preserve">So sánh trực tiếp trên cùng mặt bằng 90m²: phòng họp 8 chỗ làm bằng vách thạch cao hai lớp chiếm khoảng 14m² tính cả tường; cũng phòng họp đó làm bằng vách kính khung nhôm chỉ chiếm khoảng 12m². Cộng thêm phòng giám đốc, hai vách kính trả lại khoảng 4m², đúng bằng </w:t>
       </w:r>
       <w:r>
         <w:rPr>
@@ -4492,7 +5010,7 @@
           <w:color w:val="5B6478"/>
           <w:sz w:val="20"/>
         </w:rPr>
-        <w:t>Buồng họp lắp ghép và vách tiêu âm di động — cách chia khu trong văn phòng 90m2 mà không xây tường (Ảnh tham khảo)</w:t>
+        <w:t>Buồng họp lắp ghép và vách tiêu âm di động, cách chia khu trong văn phòng 90m2 mà không xây tường (Ảnh tham khảo)</w:t>
       </w:r>
     </w:p>
     <w:p>
@@ -4742,7 +5260,7 @@
           <w:i w:val="0"/>
           <w:sz w:val="24"/>
         </w:rPr>
-        <w:t>Tối giản không phải là làm ít đồ cho rẻ, mà là bỏ hết những gì không có công năng: không phào chỉ, không trần giật cấp nhiều lớp, không tủ trang trí. Đồ lưu trữ giấu vào tường hoặc gom vào một hệ tủ duy nhất. Bảng màu thường chỉ hai đến ba màu — trắng, be, gỗ sáng — cộng đúng một màu nhấn.</w:t>
+        <w:t>Tối giản không phải là làm ít đồ cho rẻ, mà là bỏ hết những gì không có công năng: không phào chỉ, không trần giật cấp nhiều lớp, không tủ trang trí. Đồ lưu trữ giấu vào tường hoặc gom vào một hệ tủ duy nhất. Bảng màu thường chỉ hai đến ba màu gồm trắng, be, gỗ sáng, cộng đúng một màu nhấn.</w:t>
       </w:r>
     </w:p>
     <w:p>
@@ -4868,7 +5386,7 @@
           <w:i w:val="0"/>
           <w:sz w:val="24"/>
         </w:rPr>
-        <w:t xml:space="preserve">Phần trang trí thuần túy — phào chỉ, trần giật cấp, tủ trưng bày — thường chiếm 10 – 15% tổng chi phí thi công. Với văn phòng 90m² làm gói tiêu chuẩn (360 – 630 triệu), bỏ hẳn nhóm này tiết kiệm khoảng </w:t>
+        <w:t xml:space="preserve">Phần trang trí thuần túy gồm phào chỉ, trần giật cấp và tủ trưng bày thường chiếm 10 – 15% tổng chi phí thi công. Với văn phòng 90m² làm gói tiêu chuẩn (360 – 630 triệu), bỏ hẳn nhóm này tiết kiệm khoảng </w:t>
       </w:r>
       <w:r>
         <w:rPr>
@@ -5230,7 +5748,7 @@
           <w:i w:val="0"/>
           <w:sz w:val="24"/>
         </w:rPr>
-        <w:t xml:space="preserve"> Một hàng bồn cây cao 1,2m tách được khu làm việc với lối đi mà không chắn sáng, không tính là vách — đúng thứ mặt bằng 90m² cần.</w:t>
+        <w:t xml:space="preserve"> Một hàng bồn cây cao 1,2m tách được khu làm việc với lối đi mà không chắn sáng, không tính là vách, đúng thứ mặt bằng 90m² cần.</w:t>
       </w:r>
     </w:p>
     <w:p>
@@ -5372,7 +5890,7 @@
           <w:color w:val="5B6478"/>
           <w:sz w:val="20"/>
         </w:rPr>
-        <w:t>Rèm sáng màu, cây lớn và bàn thấp ở khu tiếp khách — phong cách xanh áp dụng cho khu khách nhìn thấy đầu tiên (Ảnh tham khảo)</w:t>
+        <w:t>Rèm sáng màu, cây lớn và bàn thấp ở khu tiếp khách, phong cách xanh áp dụng cho khu khách nhìn thấy đầu tiên (Ảnh tham khảo)</w:t>
       </w:r>
     </w:p>
     <w:p>
@@ -5427,7 +5945,7 @@
           <w:color w:val="5B6478"/>
           <w:sz w:val="20"/>
         </w:rPr>
-        <w:t>Cây cao và bàn dài dùng chung dưới giếng trời — cách lấy sáng cho khu làm việc sâu trong nhà (Ảnh tham khảo)</w:t>
+        <w:t>Cây cao và bàn dài dùng chung dưới giếng trời, cách lấy sáng cho khu làm việc sâu trong nhà (Ảnh tham khảo)</w:t>
       </w:r>
     </w:p>
     <w:p>
@@ -5482,7 +6000,7 @@
           <w:color w:val="5B6478"/>
           <w:sz w:val="20"/>
         </w:rPr>
-        <w:t>Giá sắt kết hợp chậu cây làm vách ngăn — chia khu mà không chắn sáng (Ảnh tham khảo)</w:t>
+        <w:t>Giá sắt kết hợp chậu cây làm vách ngăn, chia khu mà không chắn sáng (Ảnh tham khảo)</w:t>
       </w:r>
     </w:p>
     <w:p>
@@ -5652,7 +6170,7 @@
           <w:i w:val="0"/>
           <w:sz w:val="24"/>
         </w:rPr>
-        <w:t>Nhiều chỗ ngồi nhất — lên tới 20 chỗ.</w:t>
+        <w:t>Nhiều chỗ ngồi nhất, lên tới 20 chỗ.</w:t>
       </w:r>
       <w:r>
         <w:rPr>
@@ -5685,7 +6203,7 @@
           <w:i w:val="0"/>
           <w:sz w:val="24"/>
         </w:rPr>
-        <w:t xml:space="preserve"> Tăng hay giảm nhân sự chỉ cần kê lại bàn, không phải đập vách — quan trọng với doanh nghiệp đang lớn.</w:t>
+        <w:t xml:space="preserve"> Tăng hay giảm nhân sự chỉ cần kê lại bàn, không phải đập vách, quan trọng với doanh nghiệp đang lớn.</w:t>
       </w:r>
     </w:p>
     <w:p>
@@ -5748,7 +6266,7 @@
           <w:i w:val="0"/>
           <w:sz w:val="24"/>
         </w:rPr>
-        <w:t xml:space="preserve">Trên 90m², phương án chia ba phòng kín cần khoảng 9 – 12m² cho riêng phần tường, vách và hành lang dẫn vào. Bỏ hết phòng kín, phần đó quay về khu làm việc chung — tương đương </w:t>
+        <w:t xml:space="preserve">Trên 90m², phương án chia ba phòng kín cần khoảng 9 – 12m² cho riêng phần tường, vách và hành lang dẫn vào. Bỏ hết phòng kín, phần đó quay về khu làm việc chung, tương đương </w:t>
       </w:r>
       <w:r>
         <w:rPr>
@@ -5766,7 +6284,7 @@
           <w:i w:val="0"/>
           <w:sz w:val="24"/>
         </w:rPr>
-        <w:t>. Cái giá là tiếng ồn: cần trần tiêu âm hoặc tấm tiêu âm treo, chi phí khoảng 300.000 – 600.000đ/m², tức 12 – 24 triệu cho phần khu làm việc — nhỏ so với giá trị của 3 – 4 chỗ ngồi thêm. Với 90m², phương án cân bằng nhất là mở hoàn toàn khu làm việc nhưng vẫn giữ đúng một phòng họp kín tiếng.</w:t>
+        <w:t>. Cái giá là tiếng ồn: cần trần tiêu âm hoặc tấm tiêu âm treo, chi phí khoảng 300.000 – 600.000đ/m², tức 12 – 24 triệu cho phần khu làm việc, nhỏ so với giá trị của 3 – 4 chỗ ngồi thêm. Với 90m², phương án cân bằng nhất là mở hoàn toàn khu làm việc nhưng vẫn giữ đúng một phòng họp kín tiếng.</w:t>
       </w:r>
     </w:p>
     <w:p>
@@ -6089,7 +6607,7 @@
           <w:i w:val="0"/>
           <w:sz w:val="24"/>
         </w:rPr>
-        <w:t xml:space="preserve"> — trần thấp mà để lộ hệ kỹ thuật sẽ gây cảm giác nặng và bí.</w:t>
+        <w:t>. Trần thấp mà để lộ hệ kỹ thuật sẽ gây cảm giác nặng và bí.</w:t>
       </w:r>
     </w:p>
     <w:p>
@@ -6233,7 +6751,7 @@
           <w:i w:val="0"/>
           <w:sz w:val="24"/>
         </w:rPr>
-        <w:t xml:space="preserve"> cho cả sàn. Bỏ trần giả và chỉ sơn hệ kỹ thuật màu tối tiết kiệm phần lớn khoản này, đồng thời trả lại 30 – 50cm chiều cao. Đổi lại, hệ điện và điều hòa phải đi gọn và thẳng hàng vì không còn chỗ giấu — hạng mục này cần chốt bản vẽ kỹ trước khi thi công.</w:t>
+        <w:t xml:space="preserve"> cho cả sàn. Bỏ trần giả và chỉ sơn hệ kỹ thuật màu tối tiết kiệm phần lớn khoản này, đồng thời trả lại 30 – 50cm chiều cao. Đổi lại, hệ điện và điều hòa phải đi gọn và thẳng hàng vì không còn chỗ giấu, nên hạng mục này cần chốt bản vẽ kỹ trước khi thi công.</w:t>
       </w:r>
     </w:p>
     <w:p>
@@ -6288,7 +6806,7 @@
           <w:color w:val="5B6478"/>
           <w:sz w:val="20"/>
         </w:rPr>
-        <w:t>Hộp phòng họp bằng gỗ ép dựng giữa sàn mở — tách tiếng ồn mà không xây tường (Ảnh tham khảo)</w:t>
+        <w:t>Hộp phòng họp bằng gỗ ép dựng giữa sàn mở, tách tiếng ồn mà không xây tường (Ảnh tham khảo)</w:t>
       </w:r>
     </w:p>
     <w:p>
@@ -6538,7 +7056,7 @@
           <w:i w:val="0"/>
           <w:sz w:val="24"/>
         </w:rPr>
-        <w:t xml:space="preserve">Phong cách là thứ doanh nghiệp được chọn. Hình dạng mặt bằng thì không — nó đã có sẵn khi ký hợp đồng thuê. Ba dạng dưới đây tương ứng với ba sơ đồ ở mục 4. Với mỗi dạng, phần quan trọng nhất là </w:t>
+        <w:t xml:space="preserve">Phong cách là thứ doanh nghiệp được chọn. Hình dạng mặt bằng thì không, vì nó đã có sẵn khi ký hợp đồng thuê. Ba dạng dưới đây tương ứng với ba sơ đồ ở mục 4. Với mỗi dạng, phần quan trọng nhất là </w:t>
       </w:r>
       <w:r>
         <w:rPr>
@@ -6571,7 +7089,7 @@
           <w:color w:val="1F2A44"/>
           <w:sz w:val="27"/>
         </w:rPr>
-        <w:t>7.1. Mẫu văn phòng 90m2 mặt bằng hẹp và dài</w:t>
+        <w:t>7.1. Mẫu thiết kế văn phòng 90m2 mặt bằng hẹp và dài</w:t>
       </w:r>
     </w:p>
     <w:p>
@@ -6586,7 +7104,7 @@
           <w:i w:val="0"/>
           <w:sz w:val="24"/>
         </w:rPr>
-        <w:t>Dạng phổ biến nhất trong các tòa văn phòng cho thuê, tỷ lệ từ 1:3 đến 1:4 — với 90m² thường là 18m × 5m hoặc 20m × 4,5m. Cửa vào nằm ở một đầu, cửa sổ chạy dọc một hoặc hai mặt dài. Bố trí gần như bắt buộc: hai phòng kín ở hai đầu, khu làm việc chung ở giữa, lối đi chạy suốt theo trục dài.</w:t>
+        <w:t>Dạng phổ biến nhất trong các tòa văn phòng cho thuê, tỷ lệ từ 1:3 đến 1:4, với 90m² thường là 18m × 5m hoặc 20m × 4,5m. Cửa vào nằm ở một đầu, cửa sổ chạy dọc một hoặc hai mặt dài. Bố trí gần như bắt buộc: hai phòng kín ở hai đầu, khu làm việc chung ở giữa, lối đi chạy suốt theo trục dài.</w:t>
       </w:r>
     </w:p>
     <w:p>
@@ -6712,7 +7230,7 @@
           <w:i w:val="0"/>
           <w:sz w:val="24"/>
         </w:rPr>
-        <w:t>Theo sơ đồ 1 (18m × 5m), lối đi chính 1,2m chạy suốt 10m, chiếm khoảng 12m². Khu làm việc chung sâu 3,7m nên chỉ xếp được hai dãy bàn — cho 14 chỗ, cộng lễ tân là 15. Ít nhất trong ba dạng, dù diện tích y hệt.</w:t>
+        <w:t>Theo sơ đồ 1 (18m × 5m), lối đi chính 1,2m chạy suốt 10m, chiếm khoảng 12m². Khu làm việc chung sâu 3,7m nên chỉ xếp được hai dãy bàn, tức 14 chỗ, cộng lễ tân là 15. Ít nhất trong ba dạng, dù diện tích y hệt.</w:t>
       </w:r>
     </w:p>
     <w:p>
@@ -6791,7 +7309,7 @@
           <w:color w:val="5B6478"/>
           <w:sz w:val="20"/>
         </w:rPr>
-        <w:t>Phòng dài hẹp với dãy cửa sổ chạy suốt một cạnh — ánh sáng tự nhiên đều cho cả dãy bàn (Ảnh tham khảo)</w:t>
+        <w:t>Phòng dài hẹp với dãy cửa sổ chạy suốt một cạnh, ánh sáng tự nhiên đều cho cả dãy bàn (Ảnh tham khảo)</w:t>
       </w:r>
     </w:p>
     <w:p>
@@ -6956,7 +7474,7 @@
           <w:color w:val="5B6478"/>
           <w:sz w:val="20"/>
         </w:rPr>
-        <w:t>Bàn dài dùng chung bỏ được khoảng hở giữa các bàn — cách kê tiết kiệm diện tích nhất cho mặt bằng hẹp (Ảnh tham khảo)</w:t>
+        <w:t>Bàn dài dùng chung bỏ được khoảng hở giữa các bàn, cách kê tiết kiệm diện tích nhất cho mặt bằng hẹp (Ảnh tham khảo)</w:t>
       </w:r>
     </w:p>
     <w:p>
@@ -7026,7 +7544,7 @@
           <w:color w:val="1F2A44"/>
           <w:sz w:val="27"/>
         </w:rPr>
-        <w:t>7.2. Mẫu văn phòng 90m2 mặt bằng vuông cân xứng</w:t>
+        <w:t>7.2. Mẫu thiết kế văn phòng 90m2 mặt bằng vuông cân xứng</w:t>
       </w:r>
     </w:p>
     <w:p>
@@ -7041,7 +7559,7 @@
           <w:i w:val="0"/>
           <w:sz w:val="24"/>
         </w:rPr>
-        <w:t>Mặt bằng vuông hoặc gần vuông có tỷ lệ từ 1:1 đến 1:1,3 — với 90m² thường là 9,5m × 9,5m hoặc 10m × 9m. Đây là dạng dễ quy hoạch nhất: khu làm việc chung chiếm trọn một nửa, các phòng chức năng xếp dọc một cạnh, lối đi chỉ cần một trục thẳng.</w:t>
+        <w:t>Mặt bằng vuông hoặc gần vuông có tỷ lệ từ 1:1 đến 1:1,3, với 90m² thường là 9,5m × 9,5m hoặc 10m × 9m. Đây là dạng dễ quy hoạch nhất: khu làm việc chung chiếm trọn một nửa, các phòng chức năng xếp dọc một cạnh, lối đi chỉ cần một trục thẳng.</w:t>
       </w:r>
     </w:p>
     <w:p>
@@ -7167,7 +7685,7 @@
           <w:i w:val="0"/>
           <w:sz w:val="24"/>
         </w:rPr>
-        <w:t>Theo sơ đồ 2 (9,5m × 9,5m), khu làm việc chung sâu 7,3m. Mỗi dãy bàn cần khoảng 1,4m chiều sâu tính cả ghế, nên xếp được bốn dãy — gấp đôi dạng hẹp dài. Với bốn chỗ mỗi dãy, mặt bằng cho ra 16 chỗ, cộng lễ tân là 17, mà vẫn giữ đủ phòng giám đốc 9m², pantry 5m² và phòng họp 8 chỗ 12m².</w:t>
+        <w:t>Theo sơ đồ 2 (9,5m × 9,5m), khu làm việc chung sâu 7,3m. Mỗi dãy bàn cần khoảng 1,4m chiều sâu tính cả ghế, nên xếp được bốn dãy, gấp đôi dạng hẹp dài. Với bốn chỗ mỗi dãy, mặt bằng cho ra 16 chỗ, cộng lễ tân là 17, mà vẫn giữ đủ phòng giám đốc 9m², pantry 5m² và phòng họp 8 chỗ 12m².</w:t>
       </w:r>
     </w:p>
     <w:p>
@@ -7191,7 +7709,7 @@
           <w:i w:val="0"/>
           <w:sz w:val="24"/>
         </w:rPr>
-        <w:t xml:space="preserve"> sạch nhất về mặt số liệu. Hai luồng tách ngay ngưỡng cửa và không cắt nhau lần nào. Cái giá phải trả nằm chỗ khác: mặt bằng vuông thường chỉ có một đến hai mặt tiếp xúc cửa sổ, nên vị trí ngồi giữa sàn thiếu sáng tự nhiên — phải bù bằng hệ đèn đủ 400 – 500 lux trên mặt bàn.</w:t>
+        <w:t xml:space="preserve"> sạch nhất về mặt số liệu. Hai luồng tách ngay ngưỡng cửa và không cắt nhau lần nào. Cái giá phải trả nằm chỗ khác: mặt bằng vuông thường chỉ có một đến hai mặt tiếp xúc cửa sổ, nên vị trí ngồi giữa sàn thiếu sáng tự nhiên, phải bù bằng hệ đèn đủ 400 – 500 lux trên mặt bàn.</w:t>
       </w:r>
     </w:p>
     <w:p>
@@ -7246,7 +7764,7 @@
           <w:color w:val="5B6478"/>
           <w:sz w:val="20"/>
         </w:rPr>
-        <w:t>Bàn kê dọc tường kính, phòng họp ốp gỗ sát lối đi — cách chia khu quen thuộc của mặt bằng vuông (Ảnh tham khảo)</w:t>
+        <w:t>Bàn kê dọc tường kính, phòng họp ốp gỗ sát lối đi, cách chia khu quen thuộc của mặt bằng vuông (Ảnh tham khảo)</w:t>
       </w:r>
     </w:p>
     <w:p>
@@ -7481,7 +7999,7 @@
           <w:color w:val="1F2A44"/>
           <w:sz w:val="27"/>
         </w:rPr>
-        <w:t>7.3. Mẫu văn phòng 90m2 mặt bằng lô góc</w:t>
+        <w:t>7.3. Mẫu thiết kế văn phòng 90m2 mặt bằng lô góc</w:t>
       </w:r>
     </w:p>
     <w:p>
@@ -7496,7 +8014,7 @@
           <w:i w:val="0"/>
           <w:sz w:val="24"/>
         </w:rPr>
-        <w:t>Lô góc là mặt bằng nằm ở góc tòa nhà, có hai mặt tiếp xúc cửa sổ vuông góc nhau — với 90m² thường là 12m × 7,5m. Đây là dạng sáng nhất và có giá thuê cao nhất. Bài toán riêng của nó là điểm giao hai bức tường: nếu không xử lý, góc này thành góc chết.</w:t>
+        <w:t>Lô góc là mặt bằng nằm ở góc tòa nhà, có hai mặt tiếp xúc cửa sổ vuông góc nhau, với 90m² thường là 12m × 7,5m. Đây là dạng sáng nhất và có giá thuê cao nhất. Bài toán riêng của nó là điểm giao hai bức tường: nếu không xử lý, góc này thành góc chết.</w:t>
       </w:r>
     </w:p>
     <w:p>
@@ -7622,7 +8140,7 @@
           <w:i w:val="0"/>
           <w:sz w:val="24"/>
         </w:rPr>
-        <w:t xml:space="preserve">Theo sơ đồ 3 (12m × 7,5m), lễ tân 6,6m² và khu tiếp khách 10,1m² chiếm dải trên, khu làm việc chung 40m² với ba dãy bàn 5 chỗ nằm trọn phía dưới. Kết quả 16 chỗ — nhiều hơn dạng hẹp dài một chỗ, ít hơn dạng vuông một chỗ, nhưng </w:t>
+        <w:t xml:space="preserve">Theo sơ đồ 3 (12m × 7,5m), lễ tân 6,6m² và khu tiếp khách 10,1m² chiếm dải trên, khu làm việc chung 40m² với ba dãy bàn 5 chỗ nằm trọn phía dưới. Kết quả 16 chỗ, nhiều hơn dạng hẹp dài một chỗ, ít hơn dạng vuông một chỗ, nhưng </w:t>
       </w:r>
       <w:r>
         <w:rPr>
@@ -7664,7 +8182,7 @@
           <w:i w:val="0"/>
           <w:sz w:val="24"/>
         </w:rPr>
-        <w:t xml:space="preserve"> tốt nhất trong ba dạng. Cái giá là phòng họp chỉ còn 8,1m² nên tối đa 6 chỗ, và pantry bị đẩy xuống cuối lối đi. Ngoài ra hai mặt kính đồng nghĩa ít tường đặc để kê tủ hồ sơ — hệ lưu trữ phải dồn vào một cạnh hoặc chuyển sang tủ thấp dưới bệ cửa sổ.</w:t>
+        <w:t xml:space="preserve"> tốt nhất trong ba dạng. Cái giá là phòng họp chỉ còn 8,1m² nên tối đa 6 chỗ, và pantry bị đẩy xuống cuối lối đi. Ngoài ra hai mặt kính đồng nghĩa ít tường đặc để kê tủ hồ sơ, nên hệ lưu trữ phải dồn vào một cạnh hoặc chuyển sang tủ thấp dưới bệ cửa sổ.</w:t>
       </w:r>
     </w:p>
     <w:p>
@@ -7829,7 +8347,7 @@
           <w:color w:val="5B6478"/>
           <w:sz w:val="20"/>
         </w:rPr>
-        <w:t>Vách kính khung thép đen ở góc phòng — giữ được tầm nhìn hai hướng khi chia phòng riêng (Ảnh tham khảo)</w:t>
+        <w:t>Vách kính khung thép đen ở góc phòng, giữ được tầm nhìn hai hướng khi chia phòng riêng (Ảnh tham khảo)</w:t>
       </w:r>
     </w:p>
     <w:p>
@@ -7884,7 +8402,7 @@
           <w:color w:val="5B6478"/>
           <w:sz w:val="20"/>
         </w:rPr>
-        <w:t>Trần lam gỗ và bàn màu nhấn ở khu ven cửa sổ — cách làm ấm mặt bằng nhiều kính (Ảnh tham khảo)</w:t>
+        <w:t>Trần lam gỗ và bàn màu nhấn ở khu ven cửa sổ, cách làm ấm mặt bằng nhiều kính (Ảnh tham khảo)</w:t>
       </w:r>
     </w:p>
     <w:p>
@@ -8147,7 +8665,7 @@
                 <w:i w:val="0"/>
                 <w:sz w:val="21"/>
               </w:rPr>
-              <w:t>Bốn phòng kín lấy đi 12 – 15m² cho riêng phần tường, vách và hành lang dẫn vào — tương đương mất 5 – 6 chỗ ngồi</w:t>
+              <w:t>Bốn phòng kín lấy đi 12 – 15m² cho riêng phần tường, vách và hành lang dẫn vào, tương đương mất 5 – 6 chỗ ngồi</w:t>
             </w:r>
           </w:p>
         </w:tc>
@@ -8256,7 +8774,7 @@
                 <w:i w:val="0"/>
                 <w:sz w:val="21"/>
               </w:rPr>
-              <w:t>Phải đi dây nổi sau khi vào ở, hoặc đục lại sàn và vách vừa hoàn thiện — phát sinh cả chi phí lẫn thời gian ngừng làm việc</w:t>
+              <w:t>Phải đi dây nổi sau khi vào ở, hoặc đục lại sàn và vách vừa hoàn thiện, phát sinh cả chi phí lẫn thời gian ngừng làm việc</w:t>
             </w:r>
           </w:p>
         </w:tc>
@@ -8350,7 +8868,7 @@
           <w:i w:val="0"/>
           <w:sz w:val="24"/>
         </w:rPr>
-        <w:t>. Khi lên phương án, cộng thêm 15 – 20% số chỗ so với nhân sự hiện tại và chọn bàn mô-đun ghép nối được — phần dư đó dùng tạm làm bàn dự án hoặc bàn khách, không thành khoảng trống lãng phí.</w:t>
+        <w:t>. Khi lên phương án, cộng thêm 15 – 20% số chỗ so với nhân sự hiện tại và chọn bàn mô-đun ghép nối được. Phần dư đó dùng tạm làm bàn dự án hoặc bàn khách, không thành khoảng trống lãng phí.</w:t>
       </w:r>
     </w:p>
     <w:p>
@@ -8405,7 +8923,7 @@
           <w:color w:val="5B6478"/>
           <w:sz w:val="20"/>
         </w:rPr>
-        <w:t>Lối đi trong văn phòng cần tối thiểu 1,2m — bóp hẹp hơn là người ngồi trong phải đứng dậy nhường đường (Ảnh tham khảo)</w:t>
+        <w:t>Lối đi trong văn phòng cần tối thiểu 1,2m, bóp hẹp hơn là người ngồi trong phải đứng dậy nhường đường (Ảnh tham khảo)</w:t>
       </w:r>
     </w:p>
     <w:p>
@@ -8420,7 +8938,7 @@
           <w:color w:val="0B3D91"/>
           <w:sz w:val="32"/>
         </w:rPr>
-        <w:t>9. Chi phí thiết kế và thi công văn phòng 90m2</w:t>
+        <w:t>9. Chi phí thiết kế văn phòng 90m2 và chi phí thi công</w:t>
       </w:r>
     </w:p>
     <w:p>
@@ -8435,7 +8953,7 @@
           <w:i w:val="0"/>
           <w:sz w:val="24"/>
         </w:rPr>
-        <w:t xml:space="preserve">Đây là chỗ dễ hiểu nhầm nhất, và cũng là chỗ thông tin trên mạng lệch nhau nhiều nhất. Khảo sát các đơn vị đang công bố giá cho diện tích này cho thấy phí thiết kế được báo từ 115.000đ/m² tới 1.500.000đ/m² — </w:t>
+        <w:t xml:space="preserve">Đây là chỗ dễ hiểu nhầm nhất, và cũng là chỗ thông tin trên mạng lệch nhau nhiều nhất. Khảo sát các đơn vị đang công bố giá cho diện tích này cho thấy phí thiết kế được báo từ 115.000đ/m² tới 1.500.000đ/m², </w:t>
       </w:r>
       <w:r>
         <w:rPr>
@@ -8468,7 +8986,7 @@
           <w:color w:val="1F2A44"/>
           <w:sz w:val="27"/>
         </w:rPr>
-        <w:t>9.1. Phí thiết kế và chi phí thi công là hai khoản khác nhau</w:t>
+        <w:t>9.1. Phí thiết kế văn phòng 90m2 và tiền thi công là hai khoản khác nhau</w:t>
       </w:r>
     </w:p>
     <w:tbl>
@@ -8779,7 +9297,7 @@
           <w:color w:val="5B6478"/>
           <w:sz w:val="21"/>
         </w:rPr>
-        <w:t>Gói cơ bản: sơn, sàn, trần, hệ điện cơ bản, nội thất rời phổ thông. Gói tiêu chuẩn: thêm vách kính, tủ âm tường, hệ chiếu sáng thiết kế riêng, nội thất đặt sản xuất. Gói cao cấp: vật liệu nhập khẩu, hệ thống thông minh, gia công đặc thù. Đây là khoảng giá tham khảo — báo giá thực tế phụ thuộc hiện trạng mặt bằng và yêu cầu riêng.</w:t>
+        <w:t>Gói cơ bản: sơn, sàn, trần, hệ điện cơ bản, nội thất rời phổ thông. Gói tiêu chuẩn: thêm vách kính, tủ âm tường, hệ chiếu sáng thiết kế riêng, nội thất đặt sản xuất. Gói cao cấp: vật liệu nhập khẩu, hệ thống thông minh, gia công đặc thù. Đây là khoảng giá tham khảo. Báo giá thực tế phụ thuộc hiện trạng mặt bằng và yêu cầu riêng.</w:t>
       </w:r>
     </w:p>
     <w:p>
@@ -8812,7 +9330,7 @@
           <w:i w:val="0"/>
           <w:sz w:val="24"/>
         </w:rPr>
-        <w:t>, tức tiền trả cho bản vẽ 2D, phối cảnh 3D và hồ sơ kỹ thuật. Nó không bao gồm một viên gạch nào. Chi phí thi công mới là khoản lớn, gấp khoảng 15 – 20 lần phí thiết kế. Nhiều bài viết ghi “chi phí thiết kế thi công 90m2 khoảng 30 triệu” — đó là đang lấy phí thiết kế gọi thành chi phí trọn gói.</w:t>
+        <w:t>, tức tiền trả cho bản vẽ 2D, phối cảnh 3D và hồ sơ kỹ thuật. Nó không bao gồm một viên gạch nào. Chi phí thi công mới là khoản lớn, gấp khoảng 15 – 20 lần phí thiết kế. Nhiều bài viết ghi “chi phí thiết kế thi công 90m2 khoảng 30 triệu”, đó là đang lấy phí thiết kế gọi thành chi phí trọn gói.</w:t>
       </w:r>
     </w:p>
     <w:p>
@@ -8827,7 +9345,7 @@
           <w:color w:val="1F2A44"/>
           <w:sz w:val="27"/>
         </w:rPr>
-        <w:t>9.2. Vì sao phí thiết kế giữa các đơn vị chênh nhau nhiều đến vậy</w:t>
+        <w:t>9.2. Vì sao phí thiết kế văn phòng 90m2 giữa các đơn vị chênh nhau nhiều</w:t>
       </w:r>
     </w:p>
     <w:p>
@@ -8971,7 +9489,7 @@
           <w:color w:val="1F2A44"/>
           <w:sz w:val="27"/>
         </w:rPr>
-        <w:t>9.3. Tiết kiệm chi phí ở đâu mà văn phòng 90m2 vẫn chuyên nghiệp</w:t>
+        <w:t>9.3. Tiết kiệm chi phí ở đâu mà văn phòng 90m2 vẫn hiện đại</w:t>
       </w:r>
     </w:p>
     <w:p>
@@ -9004,7 +9522,7 @@
           <w:i w:val="0"/>
           <w:sz w:val="24"/>
         </w:rPr>
-        <w:t xml:space="preserve"> Ở 90m², khu khách nhìn thấy chỉ chiếm khoảng 20% diện tích — lễ tân, khu chờ và phòng họp. Đầu tư đúng mức vào 20% đó, phần còn lại dùng vật liệu phổ thông mà không ai nhận ra.</w:t>
+        <w:t xml:space="preserve"> Ở 90m², khu khách nhìn thấy chỉ chiếm khoảng 20% diện tích, gồm lễ tân, khu chờ và phòng họp. Đầu tư đúng mức vào 20% đó, phần còn lại dùng vật liệu phổ thông mà không ai nhận ra.</w:t>
       </w:r>
     </w:p>
     <w:p>
@@ -9028,7 +9546,7 @@
           <w:i w:val="0"/>
           <w:sz w:val="24"/>
         </w:rPr>
-        <w:t>, giữ trần phẳng hoặc để mộc — tiết kiệm 22 – 36 triệu cho 90m².</w:t>
+        <w:t>, giữ trần phẳng hoặc để mộc, tiết kiệm 22 – 36 triệu cho 90m².</w:t>
       </w:r>
     </w:p>
     <w:p>
@@ -9052,7 +9570,7 @@
           <w:i w:val="0"/>
           <w:sz w:val="24"/>
         </w:rPr>
-        <w:t xml:space="preserve"> thay vách thạch cao cách âm ở phòng giám đốc — rẻ hơn, nhanh hơn, lại giữ được chỗ ngồi.</w:t>
+        <w:t xml:space="preserve"> thay vách thạch cao cách âm ở phòng giám đốc, vừa rẻ hơn và nhanh hơn, lại giữ được chỗ ngồi.</w:t>
       </w:r>
     </w:p>
     <w:p>
@@ -9100,7 +9618,7 @@
           <w:i w:val="0"/>
           <w:sz w:val="24"/>
         </w:rPr>
-        <w:t xml:space="preserve"> nên ưu tiên hạng mục tháo lắp mang đi được — bàn, tủ, vách di động — thay vì hạng mục xây cố định.</w:t>
+        <w:t xml:space="preserve"> nên ưu tiên hạng mục tháo lắp mang đi được như bàn, tủ, vách di động, thay vì hạng mục xây cố định.</w:t>
       </w:r>
     </w:p>
     <w:p>
@@ -9115,7 +9633,7 @@
           <w:color w:val="0B3D91"/>
           <w:sz w:val="32"/>
         </w:rPr>
-        <w:t>10. Vì sao chọn Crystal Design TPL cho văn phòng 90m2</w:t>
+        <w:t>10. Vì sao chọn Crystal Design TPL cho thiết kế văn phòng 90m2</w:t>
       </w:r>
     </w:p>
     <w:p>
@@ -9172,7 +9690,7 @@
           <w:i w:val="0"/>
           <w:sz w:val="24"/>
         </w:rPr>
-        <w:t xml:space="preserve"> Nội thất do chính công ty sản xuất nên chủ động được tiến độ và điều chỉnh kích thước theo đúng mặt bằng thực tế — quan trọng khi phải kê vừa 16 – 18 chỗ ngồi mà vẫn giữ đủ lối đi 1,2 – 1,4m.</w:t>
+        <w:t xml:space="preserve"> Nội thất do chính công ty sản xuất nên chủ động được tiến độ và điều chỉnh kích thước theo đúng mặt bằng thực tế, quan trọng khi phải kê vừa 16 – 18 chỗ ngồi mà vẫn giữ đủ lối đi 1,2 – 1,4m.</w:t>
       </w:r>
     </w:p>
     <w:p>
@@ -9275,7 +9793,7 @@
           <w:color w:val="5B6478"/>
           <w:sz w:val="20"/>
         </w:rPr>
-        <w:t>Khu vực lễ tân do Crystal Design TPL thiết kế và thi công — điểm dừng đầu tiên của luồng khách</w:t>
+        <w:t>Khu vực lễ tân do Crystal Design TPL thiết kế và thi công, điểm dừng đầu tiên của luồng khách</w:t>
       </w:r>
     </w:p>
     <w:p>
@@ -9305,7 +9823,7 @@
           <w:color w:val="1F2A44"/>
           <w:sz w:val="27"/>
         </w:rPr>
-        <w:t>11.1. Văn phòng 90m2 ngồi được tối đa bao nhiêu người?</w:t>
+        <w:t>11.1. Thiết kế văn phòng 90m2 ngồi được tối đa bao nhiêu người?</w:t>
       </w:r>
     </w:p>
     <w:p>
@@ -9500,7 +10018,7 @@
           <w:i w:val="0"/>
           <w:sz w:val="24"/>
         </w:rPr>
-        <w:t xml:space="preserve"> — buồng này chiếm rất ít diện tích nhưng giải quyết đúng vấn đề tiếng ồn của không gian mở. Làm hai phòng họp kín trên 90m² thì mất 5 – 6 chỗ ngồi, thường không đáng.</w:t>
+        <w:t>. Buồng này chiếm rất ít diện tích nhưng giải quyết đúng vấn đề tiếng ồn của không gian mở. Làm hai phòng họp kín trên 90m² thì mất 5 – 6 chỗ ngồi, thường không đáng.</w:t>
       </w:r>
     </w:p>
     <w:p>
@@ -9545,7 +10063,7 @@
           <w:i w:val="0"/>
           <w:sz w:val="24"/>
         </w:rPr>
-        <w:t xml:space="preserve">Tóm lại, một mặt bằng 90m² chia được đủ năm khu chức năng và bố trí 15 – 18 chỗ ngồi ở mức phổ biến, trong đó riêng hình dạng mặt bằng đã làm con số chênh nhau khoảng 2 chỗ. Về ngân sách, phí thiết kế rơi vào 13,5 – 36 triệu, còn chi phí thi công là 225 – 630 triệu tùy gói vật liệu; toàn bộ quá trình từ khảo sát đến bàn giao mất khoảng 30 – 40 ngày. Điều đáng nhớ nhất là 90m² đã đủ rộng để không phải cắt bớt gì, nên thứ quyết định văn phòng chạy trơn hay không nằm ở chỗ khác: </w:t>
+        <w:t xml:space="preserve">Tóm lại, một mặt bằng 90m² chia được đủ năm khu chức năng và bố trí 15 – 18 chỗ ngồi ở mức phổ biến, trong đó riêng hình dạng mặt bằng đã làm con số chênh nhau khoảng 2 chỗ. Về ngân sách, phí thiết kế rơi vào 13,5 – 36 triệu, còn chi phí thi công là 225 – 630 triệu tùy gói vật liệu; toàn bộ quá trình từ khảo sát đến bàn giao mất khoảng 30 – 40 ngày. Điều đáng nhớ nhất là 90m² đã đủ rộng để không phải cắt bớt gì, nên thứ quyết định văn phòng chạy trơn hay không nằm ở ba chỗ khác: chia khu đúng, hai luồng đi không giẫm chân nhau, và làm theo cách hiện đại là chia bằng kính và nội thất thay vì bằng tường. Nói gọn lại, </w:t>
       </w:r>
       <w:r>
         <w:rPr>
@@ -9591,7 +10109,7 @@
                 <w:color w:val="0B3D91"/>
                 <w:sz w:val="23"/>
               </w:rPr>
-              <w:t>Đặng Trường Minh — Giám đốc Thiết kế, Crystal Design TPL</w:t>
+              <w:t>Đặng Trường Minh, Giám đốc Thiết kế Crystal Design TPL</w:t>
             </w:r>
           </w:p>
           <w:p>
@@ -9637,7 +10155,7 @@
           <w:i w:val="0"/>
           <w:sz w:val="24"/>
         </w:rPr>
-        <w:t>TCVN 4601:2012 — Công sở cơ quan hành chính nhà nước: yêu cầu thiết kế (tiêu chuẩn diện tích làm việc).</w:t>
+        <w:t>TCVN 4601:2012 về công sở cơ quan hành chính nhà nước, yêu cầu thiết kế (tiêu chuẩn diện tích làm việc).</w:t>
       </w:r>
     </w:p>
     <w:p>
@@ -9652,7 +10170,7 @@
           <w:i w:val="0"/>
           <w:sz w:val="24"/>
         </w:rPr>
-        <w:t>QCVN 06:2022/BXD — Quy chuẩn kỹ thuật quốc gia về an toàn cháy cho nhà và công trình (yêu cầu bề rộng lối thoát nạn).</w:t>
+        <w:t>QCVN 06:2022/BXD, quy chuẩn kỹ thuật quốc gia về an toàn cháy cho nhà và công trình (yêu cầu bề rộng lối thoát nạn).</w:t>
       </w:r>
     </w:p>
     <w:p>

</xml_diff>